<commit_message>
used code from JB class for posterior summaries
</commit_message>
<xml_diff>
--- a/figures/All figs.docx
+++ b/figures/All figs.docx
@@ -2,113 +2,6 @@
 <file path=word/document.xml><?xml version="1.0" encoding="utf-8"?>
 <w:document xmlns:wpc="http://schemas.microsoft.com/office/word/2010/wordprocessingCanvas" xmlns:cx="http://schemas.microsoft.com/office/drawing/2014/chartex" xmlns:cx1="http://schemas.microsoft.com/office/drawing/2015/9/8/chartex" xmlns:cx2="http://schemas.microsoft.com/office/drawing/2015/10/21/chartex" xmlns:cx3="http://schemas.microsoft.com/office/drawing/2016/5/9/chartex" xmlns:cx4="http://schemas.microsoft.com/office/drawing/2016/5/10/chartex" xmlns:cx5="http://schemas.microsoft.com/office/drawing/2016/5/11/chartex" xmlns:cx6="http://schemas.microsoft.com/office/drawing/2016/5/12/chartex" xmlns:cx7="http://schemas.microsoft.com/office/drawing/2016/5/13/chartex" xmlns:cx8="http://schemas.microsoft.com/office/drawing/2016/5/14/chartex" xmlns:mc="http://schemas.openxmlformats.org/markup-compatibility/2006" xmlns:aink="http://schemas.microsoft.com/office/drawing/2016/ink" xmlns:am3d="http://schemas.microsoft.com/office/drawing/2017/model3d" xmlns:o="urn:schemas-microsoft-com:office:office" xmlns:oel="http://schemas.microsoft.com/office/2019/extlst" xmlns:r="http://schemas.openxmlformats.org/officeDocument/2006/relationships" xmlns:m="http://schemas.openxmlformats.org/officeDocument/2006/math" xmlns:v="urn:schemas-microsoft-com:vml" xmlns:wp14="http://schemas.microsoft.com/office/word/2010/wordprocessingDrawing" xmlns:wp="http://schemas.openxmlformats.org/drawingml/2006/wordprocessingDrawing" xmlns:w10="urn:schemas-microsoft-com:office:word" xmlns:w="http://schemas.openxmlformats.org/wordprocessingml/2006/main" xmlns:w14="http://schemas.microsoft.com/office/word/2010/wordml" xmlns:w15="http://schemas.microsoft.com/office/word/2012/wordml" xmlns:w16cex="http://schemas.microsoft.com/office/word/2018/wordml/cex" xmlns:w16cid="http://schemas.microsoft.com/office/word/2016/wordml/cid" xmlns:w16="http://schemas.microsoft.com/office/word/2018/wordml" xmlns:w16du="http://schemas.microsoft.com/office/word/2023/wordml/word16du" xmlns:w16sdtdh="http://schemas.microsoft.com/office/word/2020/wordml/sdtdatahash" xmlns:w16sdtfl="http://schemas.microsoft.com/office/word/2024/wordml/sdtformatlock" xmlns:w16se="http://schemas.microsoft.com/office/word/2015/wordml/symex" xmlns:wpg="http://schemas.microsoft.com/office/word/2010/wordprocessingGroup" xmlns:wpi="http://schemas.microsoft.com/office/word/2010/wordprocessingInk" xmlns:wne="http://schemas.microsoft.com/office/word/2006/wordml" xmlns:wps="http://schemas.microsoft.com/office/word/2010/wordprocessingShape" mc:Ignorable="w14 w15 w16se w16cid w16 w16cex w16sdtdh w16sdtfl w16du wp14">
   <w:body>
-    <w:p>
-      <w:pPr>
-        <w:jc w:val="center"/>
-      </w:pPr>
-      <w:r>
-        <w:rPr>
-          <w:noProof/>
-        </w:rPr>
-        <w:drawing>
-          <wp:inline distT="0" distB="0" distL="0" distR="0" wp14:anchorId="64168CDB" wp14:editId="0EE9E587">
-            <wp:extent cx="4458903" cy="4547986"/>
-            <wp:effectExtent l="6033" t="0" r="5397" b="5398"/>
-            <wp:docPr id="1467429557" name="Picture 2" descr="A graph of different colored lines&#10;&#10;Description automatically generated"/>
-            <wp:cNvGraphicFramePr>
-              <a:graphicFrameLocks xmlns:a="http://schemas.openxmlformats.org/drawingml/2006/main" noChangeAspect="1"/>
-            </wp:cNvGraphicFramePr>
-            <a:graphic xmlns:a="http://schemas.openxmlformats.org/drawingml/2006/main">
-              <a:graphicData uri="http://schemas.openxmlformats.org/drawingml/2006/picture">
-                <pic:pic xmlns:pic="http://schemas.openxmlformats.org/drawingml/2006/picture">
-                  <pic:nvPicPr>
-                    <pic:cNvPr id="1467429557" name="Picture 2" descr="A graph of different colored lines&#10;&#10;Description automatically generated"/>
-                    <pic:cNvPicPr/>
-                  </pic:nvPicPr>
-                  <pic:blipFill>
-                    <a:blip r:embed="rId4" cstate="print">
-                      <a:extLst>
-                        <a:ext uri="{28A0092B-C50C-407E-A947-70E740481C1C}">
-                          <a14:useLocalDpi xmlns:a14="http://schemas.microsoft.com/office/drawing/2010/main" val="0"/>
-                        </a:ext>
-                      </a:extLst>
-                    </a:blip>
-                    <a:stretch>
-                      <a:fillRect/>
-                    </a:stretch>
-                  </pic:blipFill>
-                  <pic:spPr>
-                    <a:xfrm rot="5400000">
-                      <a:off x="0" y="0"/>
-                      <a:ext cx="4581499" cy="4673031"/>
-                    </a:xfrm>
-                    <a:prstGeom prst="rect">
-                      <a:avLst/>
-                    </a:prstGeom>
-                  </pic:spPr>
-                </pic:pic>
-              </a:graphicData>
-            </a:graphic>
-          </wp:inline>
-        </w:drawing>
-      </w:r>
-    </w:p>
-    <w:p>
-      <w:pPr>
-        <w:jc w:val="center"/>
-      </w:pPr>
-      <w:r>
-        <w:rPr>
-          <w:noProof/>
-        </w:rPr>
-        <w:drawing>
-          <wp:inline distT="0" distB="0" distL="0" distR="0" wp14:anchorId="08F0AF6E" wp14:editId="7EC2B6C0">
-            <wp:extent cx="4504534" cy="4889056"/>
-            <wp:effectExtent l="0" t="1905" r="2540" b="2540"/>
-            <wp:docPr id="849418092" name="Picture 1" descr="A graph of different colored lines&#10;&#10;Description automatically generated"/>
-            <wp:cNvGraphicFramePr>
-              <a:graphicFrameLocks xmlns:a="http://schemas.openxmlformats.org/drawingml/2006/main" noChangeAspect="1"/>
-            </wp:cNvGraphicFramePr>
-            <a:graphic xmlns:a="http://schemas.openxmlformats.org/drawingml/2006/main">
-              <a:graphicData uri="http://schemas.openxmlformats.org/drawingml/2006/picture">
-                <pic:pic xmlns:pic="http://schemas.openxmlformats.org/drawingml/2006/picture">
-                  <pic:nvPicPr>
-                    <pic:cNvPr id="849418092" name="Picture 1" descr="A graph of different colored lines&#10;&#10;Description automatically generated"/>
-                    <pic:cNvPicPr/>
-                  </pic:nvPicPr>
-                  <pic:blipFill>
-                    <a:blip r:embed="rId5" cstate="print">
-                      <a:extLst>
-                        <a:ext uri="{28A0092B-C50C-407E-A947-70E740481C1C}">
-                          <a14:useLocalDpi xmlns:a14="http://schemas.microsoft.com/office/drawing/2010/main" val="0"/>
-                        </a:ext>
-                      </a:extLst>
-                    </a:blip>
-                    <a:stretch>
-                      <a:fillRect/>
-                    </a:stretch>
-                  </pic:blipFill>
-                  <pic:spPr>
-                    <a:xfrm rot="5400000">
-                      <a:off x="0" y="0"/>
-                      <a:ext cx="4523452" cy="4909589"/>
-                    </a:xfrm>
-                    <a:prstGeom prst="rect">
-                      <a:avLst/>
-                    </a:prstGeom>
-                  </pic:spPr>
-                </pic:pic>
-              </a:graphicData>
-            </a:graphic>
-          </wp:inline>
-        </w:drawing>
-      </w:r>
-    </w:p>
-    <w:p>
-      <w:pPr>
-        <w:jc w:val="center"/>
-      </w:pPr>
-    </w:p>
     <w:p>
       <w:pPr>
         <w:jc w:val="center"/>
@@ -138,7 +31,7 @@
                     <pic:cNvPicPr/>
                   </pic:nvPicPr>
                   <pic:blipFill>
-                    <a:blip r:embed="rId6" cstate="print">
+                    <a:blip r:embed="rId4" cstate="print">
                       <a:extLst>
                         <a:ext uri="{28A0092B-C50C-407E-A947-70E740481C1C}">
                           <a14:useLocalDpi xmlns:a14="http://schemas.microsoft.com/office/drawing/2010/main" val="0"/>
@@ -199,20 +92,16 @@
       <w:pPr>
         <w:jc w:val="center"/>
       </w:pPr>
-    </w:p>
-    <w:p>
-      <w:pPr>
-        <w:jc w:val="center"/>
-      </w:pPr>
       <w:r>
         <w:rPr>
           <w:noProof/>
         </w:rPr>
+        <w:lastRenderedPageBreak/>
         <w:drawing>
-          <wp:inline distT="0" distB="0" distL="0" distR="0" wp14:anchorId="15AF0819" wp14:editId="537878A2">
-            <wp:extent cx="6858000" cy="4948555"/>
-            <wp:effectExtent l="2222" t="0" r="2223" b="2222"/>
-            <wp:docPr id="249358063" name="Picture 5" descr="A graph of a number of blue and red lines&#10;&#10;Description automatically generated with medium confidence"/>
+          <wp:inline distT="0" distB="0" distL="0" distR="0" wp14:anchorId="032B2150" wp14:editId="5A0FC0F6">
+            <wp:extent cx="6858000" cy="5873750"/>
+            <wp:effectExtent l="0" t="3175" r="0" b="0"/>
+            <wp:docPr id="1954886219" name="Picture 1" descr="A graph of a number of different distribution points&#10;&#10;Description automatically generated with medium confidence"/>
             <wp:cNvGraphicFramePr>
               <a:graphicFrameLocks xmlns:a="http://schemas.openxmlformats.org/drawingml/2006/main" noChangeAspect="1"/>
             </wp:cNvGraphicFramePr>
@@ -220,7 +109,141 @@
               <a:graphicData uri="http://schemas.openxmlformats.org/drawingml/2006/picture">
                 <pic:pic xmlns:pic="http://schemas.openxmlformats.org/drawingml/2006/picture">
                   <pic:nvPicPr>
-                    <pic:cNvPr id="249358063" name="Picture 5" descr="A graph of a number of blue and red lines&#10;&#10;Description automatically generated with medium confidence"/>
+                    <pic:cNvPr id="1954886219" name="Picture 1" descr="A graph of a number of different distribution points&#10;&#10;Description automatically generated with medium confidence"/>
+                    <pic:cNvPicPr/>
+                  </pic:nvPicPr>
+                  <pic:blipFill>
+                    <a:blip r:embed="rId5" cstate="print">
+                      <a:extLst>
+                        <a:ext uri="{28A0092B-C50C-407E-A947-70E740481C1C}">
+                          <a14:useLocalDpi xmlns:a14="http://schemas.microsoft.com/office/drawing/2010/main" val="0"/>
+                        </a:ext>
+                      </a:extLst>
+                    </a:blip>
+                    <a:stretch>
+                      <a:fillRect/>
+                    </a:stretch>
+                  </pic:blipFill>
+                  <pic:spPr>
+                    <a:xfrm>
+                      <a:off x="0" y="0"/>
+                      <a:ext cx="6858000" cy="5873750"/>
+                    </a:xfrm>
+                    <a:prstGeom prst="rect">
+                      <a:avLst/>
+                    </a:prstGeom>
+                  </pic:spPr>
+                </pic:pic>
+              </a:graphicData>
+            </a:graphic>
+          </wp:inline>
+        </w:drawing>
+      </w:r>
+    </w:p>
+    <w:p>
+      <w:pPr>
+        <w:jc w:val="center"/>
+      </w:pPr>
+    </w:p>
+    <w:p>
+      <w:pPr>
+        <w:jc w:val="center"/>
+      </w:pPr>
+    </w:p>
+    <w:p>
+      <w:pPr>
+        <w:jc w:val="center"/>
+      </w:pPr>
+    </w:p>
+    <w:p>
+      <w:pPr>
+        <w:jc w:val="center"/>
+      </w:pPr>
+    </w:p>
+    <w:p>
+      <w:pPr>
+        <w:jc w:val="center"/>
+      </w:pPr>
+    </w:p>
+    <w:p>
+      <w:pPr>
+        <w:jc w:val="center"/>
+      </w:pPr>
+    </w:p>
+    <w:p>
+      <w:pPr>
+        <w:jc w:val="center"/>
+      </w:pPr>
+      <w:r>
+        <w:rPr>
+          <w:noProof/>
+        </w:rPr>
+        <w:lastRenderedPageBreak/>
+        <w:drawing>
+          <wp:inline distT="0" distB="0" distL="0" distR="0" wp14:anchorId="55627054" wp14:editId="0C05A853">
+            <wp:extent cx="5993394" cy="4986725"/>
+            <wp:effectExtent l="0" t="0" r="1270" b="4445"/>
+            <wp:docPr id="171455164" name="Picture 4" descr="A group of graphs showing different types of covaries&#10;&#10;Description automatically generated"/>
+            <wp:cNvGraphicFramePr>
+              <a:graphicFrameLocks xmlns:a="http://schemas.openxmlformats.org/drawingml/2006/main" noChangeAspect="1"/>
+            </wp:cNvGraphicFramePr>
+            <a:graphic xmlns:a="http://schemas.openxmlformats.org/drawingml/2006/main">
+              <a:graphicData uri="http://schemas.openxmlformats.org/drawingml/2006/picture">
+                <pic:pic xmlns:pic="http://schemas.openxmlformats.org/drawingml/2006/picture">
+                  <pic:nvPicPr>
+                    <pic:cNvPr id="171455164" name="Picture 4" descr="A group of graphs showing different types of covaries&#10;&#10;Description automatically generated"/>
+                    <pic:cNvPicPr/>
+                  </pic:nvPicPr>
+                  <pic:blipFill>
+                    <a:blip r:embed="rId6" cstate="print">
+                      <a:extLst>
+                        <a:ext uri="{28A0092B-C50C-407E-A947-70E740481C1C}">
+                          <a14:useLocalDpi xmlns:a14="http://schemas.microsoft.com/office/drawing/2010/main" val="0"/>
+                        </a:ext>
+                      </a:extLst>
+                    </a:blip>
+                    <a:stretch>
+                      <a:fillRect/>
+                    </a:stretch>
+                  </pic:blipFill>
+                  <pic:spPr>
+                    <a:xfrm>
+                      <a:off x="0" y="0"/>
+                      <a:ext cx="6052123" cy="5035589"/>
+                    </a:xfrm>
+                    <a:prstGeom prst="rect">
+                      <a:avLst/>
+                    </a:prstGeom>
+                  </pic:spPr>
+                </pic:pic>
+              </a:graphicData>
+            </a:graphic>
+          </wp:inline>
+        </w:drawing>
+      </w:r>
+    </w:p>
+    <w:p/>
+    <w:p>
+      <w:pPr>
+        <w:jc w:val="center"/>
+      </w:pPr>
+      <w:r>
+        <w:rPr>
+          <w:noProof/>
+        </w:rPr>
+        <w:drawing>
+          <wp:inline distT="0" distB="0" distL="0" distR="0" wp14:anchorId="56A3F547" wp14:editId="5B0E2A51">
+            <wp:extent cx="3188330" cy="3460518"/>
+            <wp:effectExtent l="0" t="0" r="0" b="0"/>
+            <wp:docPr id="1200669415" name="Picture 6" descr="A graph of a graph&#10;&#10;Description automatically generated"/>
+            <wp:cNvGraphicFramePr>
+              <a:graphicFrameLocks xmlns:a="http://schemas.openxmlformats.org/drawingml/2006/main" noChangeAspect="1"/>
+            </wp:cNvGraphicFramePr>
+            <a:graphic xmlns:a="http://schemas.openxmlformats.org/drawingml/2006/main">
+              <a:graphicData uri="http://schemas.openxmlformats.org/drawingml/2006/picture">
+                <pic:pic xmlns:pic="http://schemas.openxmlformats.org/drawingml/2006/picture">
+                  <pic:nvPicPr>
+                    <pic:cNvPr id="1200669415" name="Picture 6" descr="A graph of a graph&#10;&#10;Description automatically generated"/>
                     <pic:cNvPicPr/>
                   </pic:nvPicPr>
                   <pic:blipFill>
@@ -236,9 +259,9 @@
                     </a:stretch>
                   </pic:blipFill>
                   <pic:spPr>
-                    <a:xfrm rot="5400000">
+                    <a:xfrm>
                       <a:off x="0" y="0"/>
-                      <a:ext cx="6858000" cy="4948555"/>
+                      <a:ext cx="3293096" cy="3574228"/>
                     </a:xfrm>
                     <a:prstGeom prst="rect">
                       <a:avLst/>
@@ -255,41 +278,16 @@
       <w:pPr>
         <w:jc w:val="center"/>
       </w:pPr>
-    </w:p>
-    <w:p>
-      <w:pPr>
-        <w:jc w:val="center"/>
-      </w:pPr>
-    </w:p>
-    <w:p>
-      <w:pPr>
-        <w:jc w:val="center"/>
-      </w:pPr>
-    </w:p>
-    <w:p>
-      <w:pPr>
-        <w:jc w:val="center"/>
-      </w:pPr>
-    </w:p>
-    <w:p>
-      <w:pPr>
-        <w:jc w:val="center"/>
-      </w:pPr>
-    </w:p>
-    <w:p>
-      <w:pPr>
-        <w:jc w:val="center"/>
-      </w:pPr>
       <w:r>
         <w:rPr>
           <w:noProof/>
         </w:rPr>
         <w:lastRenderedPageBreak/>
         <w:drawing>
-          <wp:inline distT="0" distB="0" distL="0" distR="0" wp14:anchorId="55627054" wp14:editId="0A4D5311">
-            <wp:extent cx="5739897" cy="4775807"/>
-            <wp:effectExtent l="0" t="0" r="635" b="0"/>
-            <wp:docPr id="171455164" name="Picture 4" descr="A group of graphs showing different types of covaries&#10;&#10;Description automatically generated"/>
+          <wp:inline distT="0" distB="0" distL="0" distR="0" wp14:anchorId="037369CC" wp14:editId="32E0B4FE">
+            <wp:extent cx="6427961" cy="5042463"/>
+            <wp:effectExtent l="0" t="0" r="0" b="0"/>
+            <wp:docPr id="1431350760" name="Picture 10" descr="A graph of a number of patients with occupancy&#10;&#10;Description automatically generated"/>
             <wp:cNvGraphicFramePr>
               <a:graphicFrameLocks xmlns:a="http://schemas.openxmlformats.org/drawingml/2006/main" noChangeAspect="1"/>
             </wp:cNvGraphicFramePr>
@@ -297,10 +295,10 @@
               <a:graphicData uri="http://schemas.openxmlformats.org/drawingml/2006/picture">
                 <pic:pic xmlns:pic="http://schemas.openxmlformats.org/drawingml/2006/picture">
                   <pic:nvPicPr>
-                    <pic:cNvPr id="171455164" name="Picture 4" descr="A group of graphs showing different types of covaries&#10;&#10;Description automatically generated"/>
+                    <pic:cNvPr id="1431350760" name="Picture 10" descr="A graph of a number of patients with occupancy&#10;&#10;Description automatically generated"/>
                     <pic:cNvPicPr/>
                   </pic:nvPicPr>
-                  <pic:blipFill>
+                  <pic:blipFill rotWithShape="1">
                     <a:blip r:embed="rId8" cstate="print">
                       <a:extLst>
                         <a:ext uri="{28A0092B-C50C-407E-A947-70E740481C1C}">
@@ -308,18 +306,25 @@
                         </a:ext>
                       </a:extLst>
                     </a:blip>
-                    <a:stretch>
-                      <a:fillRect/>
-                    </a:stretch>
+                    <a:srcRect r="8063"/>
+                    <a:stretch/>
                   </pic:blipFill>
-                  <pic:spPr>
+                  <pic:spPr bwMode="auto">
                     <a:xfrm>
                       <a:off x="0" y="0"/>
-                      <a:ext cx="5780367" cy="4809479"/>
+                      <a:ext cx="6623049" cy="5195501"/>
                     </a:xfrm>
                     <a:prstGeom prst="rect">
                       <a:avLst/>
                     </a:prstGeom>
+                    <a:ln>
+                      <a:noFill/>
+                    </a:ln>
+                    <a:extLst>
+                      <a:ext uri="{53640926-AAD7-44D8-BBD7-CCE9431645EC}">
+                        <a14:shadowObscured xmlns:a14="http://schemas.microsoft.com/office/drawing/2010/main"/>
+                      </a:ext>
+                    </a:extLst>
                   </pic:spPr>
                 </pic:pic>
               </a:graphicData>
@@ -347,17 +352,16 @@
       <w:pPr>
         <w:jc w:val="center"/>
       </w:pPr>
-    </w:p>
-    <w:p>
       <w:r>
         <w:rPr>
           <w:noProof/>
         </w:rPr>
+        <w:lastRenderedPageBreak/>
         <w:drawing>
-          <wp:inline distT="0" distB="0" distL="0" distR="0" wp14:anchorId="56A3F547" wp14:editId="7476BD69">
-            <wp:extent cx="2706986" cy="2938082"/>
+          <wp:inline distT="0" distB="0" distL="0" distR="0" wp14:anchorId="2CDB26D7" wp14:editId="48036A10">
+            <wp:extent cx="6858000" cy="4946015"/>
             <wp:effectExtent l="0" t="0" r="0" b="0"/>
-            <wp:docPr id="1200669415" name="Picture 6" descr="A graph of a graph&#10;&#10;Description automatically generated"/>
+            <wp:docPr id="1125302910" name="Picture 8" descr="A graph of numbers and lines&#10;&#10;Description automatically generated with medium confidence"/>
             <wp:cNvGraphicFramePr>
               <a:graphicFrameLocks xmlns:a="http://schemas.openxmlformats.org/drawingml/2006/main" noChangeAspect="1"/>
             </wp:cNvGraphicFramePr>
@@ -365,7 +369,7 @@
               <a:graphicData uri="http://schemas.openxmlformats.org/drawingml/2006/picture">
                 <pic:pic xmlns:pic="http://schemas.openxmlformats.org/drawingml/2006/picture">
                   <pic:nvPicPr>
-                    <pic:cNvPr id="1200669415" name="Picture 6" descr="A graph of a graph&#10;&#10;Description automatically generated"/>
+                    <pic:cNvPr id="1125302910" name="Picture 8" descr="A graph of numbers and lines&#10;&#10;Description automatically generated with medium confidence"/>
                     <pic:cNvPicPr/>
                   </pic:nvPicPr>
                   <pic:blipFill>
@@ -383,7 +387,7 @@
                   <pic:spPr>
                     <a:xfrm>
                       <a:off x="0" y="0"/>
-                      <a:ext cx="2775238" cy="3012160"/>
+                      <a:ext cx="6858000" cy="4946015"/>
                     </a:xfrm>
                     <a:prstGeom prst="rect">
                       <a:avLst/>
@@ -400,184 +404,21 @@
       <w:pPr>
         <w:jc w:val="center"/>
       </w:pPr>
+    </w:p>
+    <w:p>
+      <w:pPr>
+        <w:jc w:val="center"/>
+      </w:pPr>
+    </w:p>
+    <w:p>
+      <w:pPr>
+        <w:jc w:val="center"/>
+      </w:pPr>
       <w:r>
         <w:rPr>
           <w:noProof/>
         </w:rPr>
-        <w:drawing>
-          <wp:inline distT="0" distB="0" distL="0" distR="0" wp14:anchorId="190AC726" wp14:editId="13964B91">
-            <wp:extent cx="4572000" cy="3957320"/>
-            <wp:effectExtent l="2540" t="0" r="2540" b="2540"/>
-            <wp:docPr id="1612101844" name="Picture 7" descr="A graph of a number of people&#10;&#10;Description automatically generated with medium confidence"/>
-            <wp:cNvGraphicFramePr>
-              <a:graphicFrameLocks xmlns:a="http://schemas.openxmlformats.org/drawingml/2006/main" noChangeAspect="1"/>
-            </wp:cNvGraphicFramePr>
-            <a:graphic xmlns:a="http://schemas.openxmlformats.org/drawingml/2006/main">
-              <a:graphicData uri="http://schemas.openxmlformats.org/drawingml/2006/picture">
-                <pic:pic xmlns:pic="http://schemas.openxmlformats.org/drawingml/2006/picture">
-                  <pic:nvPicPr>
-                    <pic:cNvPr id="1612101844" name="Picture 7" descr="A graph of a number of people&#10;&#10;Description automatically generated with medium confidence"/>
-                    <pic:cNvPicPr/>
-                  </pic:nvPicPr>
-                  <pic:blipFill>
-                    <a:blip r:embed="rId10" cstate="print">
-                      <a:extLst>
-                        <a:ext uri="{28A0092B-C50C-407E-A947-70E740481C1C}">
-                          <a14:useLocalDpi xmlns:a14="http://schemas.microsoft.com/office/drawing/2010/main" val="0"/>
-                        </a:ext>
-                      </a:extLst>
-                    </a:blip>
-                    <a:stretch>
-                      <a:fillRect/>
-                    </a:stretch>
-                  </pic:blipFill>
-                  <pic:spPr>
-                    <a:xfrm rot="5400000">
-                      <a:off x="0" y="0"/>
-                      <a:ext cx="4616110" cy="3995500"/>
-                    </a:xfrm>
-                    <a:prstGeom prst="rect">
-                      <a:avLst/>
-                    </a:prstGeom>
-                  </pic:spPr>
-                </pic:pic>
-              </a:graphicData>
-            </a:graphic>
-          </wp:inline>
-        </w:drawing>
-      </w:r>
-    </w:p>
-    <w:p>
-      <w:pPr>
-        <w:jc w:val="center"/>
-      </w:pPr>
-      <w:r>
-        <w:rPr>
-          <w:noProof/>
-        </w:rPr>
-        <w:drawing>
-          <wp:inline distT="0" distB="0" distL="0" distR="0" wp14:anchorId="06FAAE78" wp14:editId="100B10F5">
-            <wp:extent cx="4092166" cy="4174009"/>
-            <wp:effectExtent l="0" t="2858" r="0" b="0"/>
-            <wp:docPr id="1853501970" name="Picture 13" descr="A graph of a number of people&#10;&#10;Description automatically generated with medium confidence"/>
-            <wp:cNvGraphicFramePr>
-              <a:graphicFrameLocks xmlns:a="http://schemas.openxmlformats.org/drawingml/2006/main" noChangeAspect="1"/>
-            </wp:cNvGraphicFramePr>
-            <a:graphic xmlns:a="http://schemas.openxmlformats.org/drawingml/2006/main">
-              <a:graphicData uri="http://schemas.openxmlformats.org/drawingml/2006/picture">
-                <pic:pic xmlns:pic="http://schemas.openxmlformats.org/drawingml/2006/picture">
-                  <pic:nvPicPr>
-                    <pic:cNvPr id="1853501970" name="Picture 13" descr="A graph of a number of people&#10;&#10;Description automatically generated with medium confidence"/>
-                    <pic:cNvPicPr/>
-                  </pic:nvPicPr>
-                  <pic:blipFill>
-                    <a:blip r:embed="rId11" cstate="print">
-                      <a:extLst>
-                        <a:ext uri="{28A0092B-C50C-407E-A947-70E740481C1C}">
-                          <a14:useLocalDpi xmlns:a14="http://schemas.microsoft.com/office/drawing/2010/main" val="0"/>
-                        </a:ext>
-                      </a:extLst>
-                    </a:blip>
-                    <a:stretch>
-                      <a:fillRect/>
-                    </a:stretch>
-                  </pic:blipFill>
-                  <pic:spPr>
-                    <a:xfrm rot="5400000">
-                      <a:off x="0" y="0"/>
-                      <a:ext cx="4122665" cy="4205118"/>
-                    </a:xfrm>
-                    <a:prstGeom prst="rect">
-                      <a:avLst/>
-                    </a:prstGeom>
-                  </pic:spPr>
-                </pic:pic>
-              </a:graphicData>
-            </a:graphic>
-          </wp:inline>
-        </w:drawing>
-      </w:r>
-    </w:p>
-    <w:p>
-      <w:pPr>
-        <w:jc w:val="center"/>
-      </w:pPr>
-    </w:p>
-    <w:p/>
-    <w:p>
-      <w:pPr>
-        <w:jc w:val="center"/>
-      </w:pPr>
-      <w:r>
-        <w:rPr>
-          <w:noProof/>
-        </w:rPr>
-        <w:drawing>
-          <wp:inline distT="0" distB="0" distL="0" distR="0" wp14:anchorId="7BB9B04A" wp14:editId="206C6DA9">
-            <wp:extent cx="7561515" cy="4728048"/>
-            <wp:effectExtent l="0" t="5715" r="2540" b="2540"/>
-            <wp:docPr id="439293445" name="Picture 8" descr="A graph with colored lines and dots&#10;&#10;Description automatically generated"/>
-            <wp:cNvGraphicFramePr>
-              <a:graphicFrameLocks xmlns:a="http://schemas.openxmlformats.org/drawingml/2006/main" noChangeAspect="1"/>
-            </wp:cNvGraphicFramePr>
-            <a:graphic xmlns:a="http://schemas.openxmlformats.org/drawingml/2006/main">
-              <a:graphicData uri="http://schemas.openxmlformats.org/drawingml/2006/picture">
-                <pic:pic xmlns:pic="http://schemas.openxmlformats.org/drawingml/2006/picture">
-                  <pic:nvPicPr>
-                    <pic:cNvPr id="439293445" name="Picture 8" descr="A graph with colored lines and dots&#10;&#10;Description automatically generated"/>
-                    <pic:cNvPicPr/>
-                  </pic:nvPicPr>
-                  <pic:blipFill>
-                    <a:blip r:embed="rId12" cstate="print">
-                      <a:extLst>
-                        <a:ext uri="{28A0092B-C50C-407E-A947-70E740481C1C}">
-                          <a14:useLocalDpi xmlns:a14="http://schemas.microsoft.com/office/drawing/2010/main" val="0"/>
-                        </a:ext>
-                      </a:extLst>
-                    </a:blip>
-                    <a:stretch>
-                      <a:fillRect/>
-                    </a:stretch>
-                  </pic:blipFill>
-                  <pic:spPr>
-                    <a:xfrm rot="5400000">
-                      <a:off x="0" y="0"/>
-                      <a:ext cx="7628749" cy="4770088"/>
-                    </a:xfrm>
-                    <a:prstGeom prst="rect">
-                      <a:avLst/>
-                    </a:prstGeom>
-                  </pic:spPr>
-                </pic:pic>
-              </a:graphicData>
-            </a:graphic>
-          </wp:inline>
-        </w:drawing>
-      </w:r>
-    </w:p>
-    <w:p>
-      <w:pPr>
-        <w:jc w:val="center"/>
-      </w:pPr>
-    </w:p>
-    <w:p>
-      <w:pPr>
-        <w:jc w:val="center"/>
-      </w:pPr>
-    </w:p>
-    <w:p>
-      <w:pPr>
-        <w:jc w:val="center"/>
-      </w:pPr>
-    </w:p>
-    <w:p>
-      <w:pPr>
-        <w:jc w:val="center"/>
-      </w:pPr>
-      <w:r>
-        <w:rPr>
-          <w:noProof/>
-        </w:rPr>
+        <w:lastRenderedPageBreak/>
         <w:drawing>
           <wp:inline distT="0" distB="0" distL="0" distR="0" wp14:anchorId="23AD522A" wp14:editId="340AE127">
             <wp:extent cx="6858000" cy="6995160"/>
@@ -594,7 +435,7 @@
                     <pic:cNvPicPr/>
                   </pic:nvPicPr>
                   <pic:blipFill>
-                    <a:blip r:embed="rId13" cstate="print">
+                    <a:blip r:embed="rId10" cstate="print">
                       <a:extLst>
                         <a:ext uri="{28A0092B-C50C-407E-A947-70E740481C1C}">
                           <a14:useLocalDpi xmlns:a14="http://schemas.microsoft.com/office/drawing/2010/main" val="0"/>
@@ -651,9 +492,9 @@
         </w:rPr>
         <w:lastRenderedPageBreak/>
         <w:drawing>
-          <wp:inline distT="0" distB="0" distL="0" distR="0" wp14:anchorId="698E5894" wp14:editId="717BC393">
-            <wp:extent cx="6074875" cy="5054521"/>
-            <wp:effectExtent l="0" t="0" r="0" b="635"/>
+          <wp:inline distT="0" distB="0" distL="0" distR="0" wp14:anchorId="698E5894" wp14:editId="1EF2A128">
+            <wp:extent cx="6419839" cy="5341544"/>
+            <wp:effectExtent l="0" t="0" r="0" b="5715"/>
             <wp:docPr id="685624982" name="Picture 10" descr="A group of graphs showing different types of covariates&#10;&#10;Description automatically generated"/>
             <wp:cNvGraphicFramePr>
               <a:graphicFrameLocks xmlns:a="http://schemas.openxmlformats.org/drawingml/2006/main" noChangeAspect="1"/>
@@ -666,7 +507,7 @@
                     <pic:cNvPicPr/>
                   </pic:nvPicPr>
                   <pic:blipFill>
-                    <a:blip r:embed="rId14" cstate="print">
+                    <a:blip r:embed="rId11" cstate="print">
                       <a:extLst>
                         <a:ext uri="{28A0092B-C50C-407E-A947-70E740481C1C}">
                           <a14:useLocalDpi xmlns:a14="http://schemas.microsoft.com/office/drawing/2010/main" val="0"/>
@@ -680,7 +521,7 @@
                   <pic:spPr>
                     <a:xfrm>
                       <a:off x="0" y="0"/>
-                      <a:ext cx="6117600" cy="5090070"/>
+                      <a:ext cx="6478463" cy="5390321"/>
                     </a:xfrm>
                     <a:prstGeom prst="rect">
                       <a:avLst/>
@@ -697,25 +538,13 @@
       <w:pPr>
         <w:jc w:val="center"/>
       </w:pPr>
-    </w:p>
-    <w:p>
-      <w:pPr>
-        <w:jc w:val="center"/>
-      </w:pPr>
-    </w:p>
-    <w:p>
-      <w:pPr>
-        <w:jc w:val="center"/>
-      </w:pPr>
-    </w:p>
-    <w:p>
       <w:r>
         <w:rPr>
           <w:noProof/>
         </w:rPr>
         <w:drawing>
-          <wp:inline distT="0" distB="0" distL="0" distR="0" wp14:anchorId="2A56DC6D" wp14:editId="5278705F">
-            <wp:extent cx="2480650" cy="2692423"/>
+          <wp:inline distT="0" distB="0" distL="0" distR="0" wp14:anchorId="2A56DC6D" wp14:editId="6A99F78D">
+            <wp:extent cx="3303178" cy="3585172"/>
             <wp:effectExtent l="0" t="0" r="0" b="0"/>
             <wp:docPr id="61462026" name="Picture 11" descr="A graph of a curve&#10;&#10;Description automatically generated"/>
             <wp:cNvGraphicFramePr>
@@ -726,6 +555,191 @@
                 <pic:pic xmlns:pic="http://schemas.openxmlformats.org/drawingml/2006/picture">
                   <pic:nvPicPr>
                     <pic:cNvPr id="61462026" name="Picture 11" descr="A graph of a curve&#10;&#10;Description automatically generated"/>
+                    <pic:cNvPicPr/>
+                  </pic:nvPicPr>
+                  <pic:blipFill>
+                    <a:blip r:embed="rId12" cstate="print">
+                      <a:extLst>
+                        <a:ext uri="{28A0092B-C50C-407E-A947-70E740481C1C}">
+                          <a14:useLocalDpi xmlns:a14="http://schemas.microsoft.com/office/drawing/2010/main" val="0"/>
+                        </a:ext>
+                      </a:extLst>
+                    </a:blip>
+                    <a:stretch>
+                      <a:fillRect/>
+                    </a:stretch>
+                  </pic:blipFill>
+                  <pic:spPr>
+                    <a:xfrm>
+                      <a:off x="0" y="0"/>
+                      <a:ext cx="3430626" cy="3723500"/>
+                    </a:xfrm>
+                    <a:prstGeom prst="rect">
+                      <a:avLst/>
+                    </a:prstGeom>
+                  </pic:spPr>
+                </pic:pic>
+              </a:graphicData>
+            </a:graphic>
+          </wp:inline>
+        </w:drawing>
+      </w:r>
+    </w:p>
+    <w:p/>
+    <w:p/>
+    <w:p>
+      <w:pPr>
+        <w:jc w:val="center"/>
+      </w:pPr>
+      <w:r>
+        <w:rPr>
+          <w:noProof/>
+        </w:rPr>
+        <w:drawing>
+          <wp:inline distT="0" distB="0" distL="0" distR="0" wp14:anchorId="639C8D91" wp14:editId="11B048AC">
+            <wp:extent cx="6933088" cy="5002737"/>
+            <wp:effectExtent l="0" t="0" r="1270" b="1270"/>
+            <wp:docPr id="987537731" name="Picture 12" descr="A graph of a number of blue lines&#10;&#10;Description automatically generated with medium confidence"/>
+            <wp:cNvGraphicFramePr>
+              <a:graphicFrameLocks xmlns:a="http://schemas.openxmlformats.org/drawingml/2006/main" noChangeAspect="1"/>
+            </wp:cNvGraphicFramePr>
+            <a:graphic xmlns:a="http://schemas.openxmlformats.org/drawingml/2006/main">
+              <a:graphicData uri="http://schemas.openxmlformats.org/drawingml/2006/picture">
+                <pic:pic xmlns:pic="http://schemas.openxmlformats.org/drawingml/2006/picture">
+                  <pic:nvPicPr>
+                    <pic:cNvPr id="987537731" name="Picture 12" descr="A graph of a number of blue lines&#10;&#10;Description automatically generated with medium confidence"/>
+                    <pic:cNvPicPr/>
+                  </pic:nvPicPr>
+                  <pic:blipFill>
+                    <a:blip r:embed="rId13" cstate="print">
+                      <a:extLst>
+                        <a:ext uri="{28A0092B-C50C-407E-A947-70E740481C1C}">
+                          <a14:useLocalDpi xmlns:a14="http://schemas.microsoft.com/office/drawing/2010/main" val="0"/>
+                        </a:ext>
+                      </a:extLst>
+                    </a:blip>
+                    <a:stretch>
+                      <a:fillRect/>
+                    </a:stretch>
+                  </pic:blipFill>
+                  <pic:spPr>
+                    <a:xfrm>
+                      <a:off x="0" y="0"/>
+                      <a:ext cx="6962286" cy="5023806"/>
+                    </a:xfrm>
+                    <a:prstGeom prst="rect">
+                      <a:avLst/>
+                    </a:prstGeom>
+                  </pic:spPr>
+                </pic:pic>
+              </a:graphicData>
+            </a:graphic>
+          </wp:inline>
+        </w:drawing>
+      </w:r>
+    </w:p>
+    <w:p/>
+    <w:p>
+      <w:pPr>
+        <w:jc w:val="center"/>
+      </w:pPr>
+    </w:p>
+    <w:p>
+      <w:pPr>
+        <w:jc w:val="center"/>
+      </w:pPr>
+    </w:p>
+    <w:p>
+      <w:pPr>
+        <w:jc w:val="center"/>
+      </w:pPr>
+      <w:r>
+        <w:rPr>
+          <w:noProof/>
+        </w:rPr>
+        <w:lastRenderedPageBreak/>
+        <w:drawing>
+          <wp:inline distT="0" distB="0" distL="0" distR="0" wp14:anchorId="5592DE08" wp14:editId="7EB8C6D1">
+            <wp:extent cx="6147303" cy="4783767"/>
+            <wp:effectExtent l="0" t="0" r="0" b="4445"/>
+            <wp:docPr id="422468062" name="Picture 11" descr="A graph of the number of occupancy estimates&#10;&#10;Description automatically generated"/>
+            <wp:cNvGraphicFramePr>
+              <a:graphicFrameLocks xmlns:a="http://schemas.openxmlformats.org/drawingml/2006/main" noChangeAspect="1"/>
+            </wp:cNvGraphicFramePr>
+            <a:graphic xmlns:a="http://schemas.openxmlformats.org/drawingml/2006/main">
+              <a:graphicData uri="http://schemas.openxmlformats.org/drawingml/2006/picture">
+                <pic:pic xmlns:pic="http://schemas.openxmlformats.org/drawingml/2006/picture">
+                  <pic:nvPicPr>
+                    <pic:cNvPr id="422468062" name="Picture 11" descr="A graph of the number of occupancy estimates&#10;&#10;Description automatically generated"/>
+                    <pic:cNvPicPr/>
+                  </pic:nvPicPr>
+                  <pic:blipFill rotWithShape="1">
+                    <a:blip r:embed="rId14" cstate="print">
+                      <a:extLst>
+                        <a:ext uri="{28A0092B-C50C-407E-A947-70E740481C1C}">
+                          <a14:useLocalDpi xmlns:a14="http://schemas.microsoft.com/office/drawing/2010/main" val="0"/>
+                        </a:ext>
+                      </a:extLst>
+                    </a:blip>
+                    <a:srcRect r="7323"/>
+                    <a:stretch/>
+                  </pic:blipFill>
+                  <pic:spPr bwMode="auto">
+                    <a:xfrm>
+                      <a:off x="0" y="0"/>
+                      <a:ext cx="6294905" cy="4898629"/>
+                    </a:xfrm>
+                    <a:prstGeom prst="rect">
+                      <a:avLst/>
+                    </a:prstGeom>
+                    <a:ln>
+                      <a:noFill/>
+                    </a:ln>
+                    <a:extLst>
+                      <a:ext uri="{53640926-AAD7-44D8-BBD7-CCE9431645EC}">
+                        <a14:shadowObscured xmlns:a14="http://schemas.microsoft.com/office/drawing/2010/main"/>
+                      </a:ext>
+                    </a:extLst>
+                  </pic:spPr>
+                </pic:pic>
+              </a:graphicData>
+            </a:graphic>
+          </wp:inline>
+        </w:drawing>
+      </w:r>
+    </w:p>
+    <w:p>
+      <w:pPr>
+        <w:jc w:val="center"/>
+      </w:pPr>
+    </w:p>
+    <w:p>
+      <w:pPr>
+        <w:jc w:val="center"/>
+      </w:pPr>
+    </w:p>
+    <w:p>
+      <w:pPr>
+        <w:jc w:val="center"/>
+      </w:pPr>
+      <w:r>
+        <w:rPr>
+          <w:noProof/>
+        </w:rPr>
+        <w:lastRenderedPageBreak/>
+        <w:drawing>
+          <wp:inline distT="0" distB="0" distL="0" distR="0" wp14:anchorId="1D35F915" wp14:editId="56D90474">
+            <wp:extent cx="6858000" cy="4946015"/>
+            <wp:effectExtent l="0" t="0" r="0" b="0"/>
+            <wp:docPr id="1861467590" name="Picture 9" descr="A graph of numbers and colored lines&#10;&#10;Description automatically generated with medium confidence"/>
+            <wp:cNvGraphicFramePr>
+              <a:graphicFrameLocks xmlns:a="http://schemas.openxmlformats.org/drawingml/2006/main" noChangeAspect="1"/>
+            </wp:cNvGraphicFramePr>
+            <a:graphic xmlns:a="http://schemas.openxmlformats.org/drawingml/2006/main">
+              <a:graphicData uri="http://schemas.openxmlformats.org/drawingml/2006/picture">
+                <pic:pic xmlns:pic="http://schemas.openxmlformats.org/drawingml/2006/picture">
+                  <pic:nvPicPr>
+                    <pic:cNvPr id="1861467590" name="Picture 9" descr="A graph of numbers and colored lines&#10;&#10;Description automatically generated with medium confidence"/>
                     <pic:cNvPicPr/>
                   </pic:nvPicPr>
                   <pic:blipFill>
@@ -743,7 +757,7 @@
                   <pic:spPr>
                     <a:xfrm>
                       <a:off x="0" y="0"/>
-                      <a:ext cx="2547095" cy="2764541"/>
+                      <a:ext cx="6858000" cy="4946015"/>
                     </a:xfrm>
                     <a:prstGeom prst="rect">
                       <a:avLst/>
@@ -756,8 +770,11 @@
         </w:drawing>
       </w:r>
     </w:p>
-    <w:p/>
-    <w:p/>
+    <w:p>
+      <w:pPr>
+        <w:jc w:val="center"/>
+      </w:pPr>
+    </w:p>
     <w:p>
       <w:pPr>
         <w:jc w:val="center"/>
@@ -766,11 +783,12 @@
         <w:rPr>
           <w:noProof/>
         </w:rPr>
+        <w:lastRenderedPageBreak/>
         <w:drawing>
-          <wp:inline distT="0" distB="0" distL="0" distR="0" wp14:anchorId="639C8D91" wp14:editId="343E3B5F">
-            <wp:extent cx="7648810" cy="5519183"/>
-            <wp:effectExtent l="0" t="1905" r="0" b="0"/>
-            <wp:docPr id="987537731" name="Picture 12" descr="A graph of a number of blue lines&#10;&#10;Description automatically generated with medium confidence"/>
+          <wp:inline distT="0" distB="0" distL="0" distR="0" wp14:anchorId="5D59FB2E" wp14:editId="6005F57E">
+            <wp:extent cx="5585988" cy="4028636"/>
+            <wp:effectExtent l="0" t="0" r="2540" b="0"/>
+            <wp:docPr id="803371881" name="Picture 5" descr="A graph of different colored lines&#10;&#10;Description automatically generated with medium confidence"/>
             <wp:cNvGraphicFramePr>
               <a:graphicFrameLocks xmlns:a="http://schemas.openxmlformats.org/drawingml/2006/main" noChangeAspect="1"/>
             </wp:cNvGraphicFramePr>
@@ -778,7 +796,7 @@
               <a:graphicData uri="http://schemas.openxmlformats.org/drawingml/2006/picture">
                 <pic:pic xmlns:pic="http://schemas.openxmlformats.org/drawingml/2006/picture">
                   <pic:nvPicPr>
-                    <pic:cNvPr id="987537731" name="Picture 12" descr="A graph of a number of blue lines&#10;&#10;Description automatically generated with medium confidence"/>
+                    <pic:cNvPr id="803371881" name="Picture 5" descr="A graph of different colored lines&#10;&#10;Description automatically generated with medium confidence"/>
                     <pic:cNvPicPr/>
                   </pic:nvPicPr>
                   <pic:blipFill>
@@ -794,9 +812,9 @@
                     </a:stretch>
                   </pic:blipFill>
                   <pic:spPr>
-                    <a:xfrm rot="5400000">
+                    <a:xfrm>
                       <a:off x="0" y="0"/>
-                      <a:ext cx="7662854" cy="5529317"/>
+                      <a:ext cx="5623165" cy="4055448"/>
                     </a:xfrm>
                     <a:prstGeom prst="rect">
                       <a:avLst/>
@@ -809,12 +827,6 @@
         </w:drawing>
       </w:r>
     </w:p>
-    <w:p/>
-    <w:p>
-      <w:pPr>
-        <w:jc w:val="center"/>
-      </w:pPr>
-    </w:p>
     <w:p>
       <w:pPr>
         <w:jc w:val="center"/>
@@ -834,10 +846,10 @@
           <w:noProof/>
         </w:rPr>
         <w:drawing>
-          <wp:inline distT="0" distB="0" distL="0" distR="0" wp14:anchorId="520D960A" wp14:editId="7DB6EDD4">
-            <wp:extent cx="7349795" cy="4595663"/>
-            <wp:effectExtent l="5397" t="0" r="0" b="0"/>
-            <wp:docPr id="115563655" name="Picture 14" descr="A graph with colored lines and dots&#10;&#10;Description automatically generated"/>
+          <wp:inline distT="0" distB="0" distL="0" distR="0" wp14:anchorId="5FA7BE2F" wp14:editId="50791609">
+            <wp:extent cx="5522614" cy="4204335"/>
+            <wp:effectExtent l="0" t="0" r="1905" b="0"/>
+            <wp:docPr id="1504395651" name="Picture 4" descr="A graph of different colored lines&#10;&#10;Description automatically generated"/>
             <wp:cNvGraphicFramePr>
               <a:graphicFrameLocks xmlns:a="http://schemas.openxmlformats.org/drawingml/2006/main" noChangeAspect="1"/>
             </wp:cNvGraphicFramePr>
@@ -845,7 +857,7 @@
               <a:graphicData uri="http://schemas.openxmlformats.org/drawingml/2006/picture">
                 <pic:pic xmlns:pic="http://schemas.openxmlformats.org/drawingml/2006/picture">
                   <pic:nvPicPr>
-                    <pic:cNvPr id="115563655" name="Picture 14" descr="A graph with colored lines and dots&#10;&#10;Description automatically generated"/>
+                    <pic:cNvPr id="1504395651" name="Picture 4" descr="A graph of different colored lines&#10;&#10;Description automatically generated"/>
                     <pic:cNvPicPr/>
                   </pic:nvPicPr>
                   <pic:blipFill>
@@ -861,9 +873,9 @@
                     </a:stretch>
                   </pic:blipFill>
                   <pic:spPr>
-                    <a:xfrm rot="5400000">
+                    <a:xfrm>
                       <a:off x="0" y="0"/>
-                      <a:ext cx="7362588" cy="4603662"/>
+                      <a:ext cx="5574425" cy="4243779"/>
                     </a:xfrm>
                     <a:prstGeom prst="rect">
                       <a:avLst/>

</xml_diff>